<commit_message>
redesign the format and code , also make it more organized
</commit_message>
<xml_diff>
--- a/assets/CSS_Course_Master_Syllabus.docx
+++ b/assets/CSS_Course_Master_Syllabus.docx
@@ -3503,6 +3503,14 @@
         </w:rPr>
         <w:t>(Supported by only ONE source: Eric Meyer's CSS book)</w:t>
       </w:r>
+    </w:p>
+    <w:p>
+      <w:pPr>
+        <w:rPr>
+          <w:sz w:val="24"/>
+          <w:szCs w:val="22"/>
+        </w:rPr>
+      </w:pPr>
     </w:p>
     <w:p>
       <w:pPr>

</xml_diff>